<commit_message>
First model and baseline comparison and improvement of documents and data
</commit_message>
<xml_diff>
--- a/docs/Analysis.docx
+++ b/docs/Analysis.docx
@@ -36,7 +36,16 @@
     </w:p>
     <w:p>
       <w:r>
-        <w:t>In this document, I will focus on analysing the problem, the dataset, possible requirements, risks and limitations, success criteria and system architecture.</w:t>
+        <w:t xml:space="preserve">In this document, I will focus on analysing the problem, the dataset, possible requirements, </w:t>
+      </w:r>
+      <w:r>
+        <w:t>challenges and</w:t>
+      </w:r>
+      <w:r>
+        <w:t xml:space="preserve"> success criteria</w:t>
+      </w:r>
+      <w:r>
+        <w:t>.</w:t>
       </w:r>
     </w:p>
     <w:p>
@@ -44,15 +53,12 @@
         <w:pStyle w:val="Heading2"/>
       </w:pPr>
       <w:r>
-        <w:t>Problem Analysis</w:t>
-      </w:r>
-    </w:p>
-    <w:p>
-      <w:r>
-        <w:t xml:space="preserve">The main problem for this project is how to predict a next drivers’ lap, based on past data and current one, and </w:t>
-      </w:r>
-      <w:r>
-        <w:t>how accurate this prediction is. The main problems for this are finding features that affect the model the most. From my previous research the main ones are:</w:t>
+        <w:t>User Requirements</w:t>
+      </w:r>
+    </w:p>
+    <w:p>
+      <w:r>
+        <w:t>The user should be able to:</w:t>
       </w:r>
     </w:p>
     <w:p>
@@ -60,11 +66,11 @@
         <w:pStyle w:val="ListParagraph"/>
         <w:numPr>
           <w:ilvl w:val="0"/>
-          <w:numId w:val="1"/>
+          <w:numId w:val="2"/>
         </w:numPr>
       </w:pPr>
       <w:r>
-        <w:t>Previous and Current Lap Times</w:t>
+        <w:t>Select a driver and a track</w:t>
       </w:r>
     </w:p>
     <w:p>
@@ -72,11 +78,11 @@
         <w:pStyle w:val="ListParagraph"/>
         <w:numPr>
           <w:ilvl w:val="0"/>
-          <w:numId w:val="1"/>
+          <w:numId w:val="2"/>
         </w:numPr>
       </w:pPr>
       <w:r>
-        <w:t>Tyre Degradation</w:t>
+        <w:t>See the predicted next lap</w:t>
       </w:r>
     </w:p>
     <w:p>
@@ -84,11 +90,11 @@
         <w:pStyle w:val="ListParagraph"/>
         <w:numPr>
           <w:ilvl w:val="0"/>
-          <w:numId w:val="1"/>
+          <w:numId w:val="2"/>
         </w:numPr>
       </w:pPr>
       <w:r>
-        <w:t>Traffic</w:t>
+        <w:t>See the comparison between real life and predicted lap</w:t>
       </w:r>
     </w:p>
     <w:p>
@@ -96,11 +102,38 @@
         <w:pStyle w:val="ListParagraph"/>
         <w:numPr>
           <w:ilvl w:val="0"/>
-          <w:numId w:val="1"/>
+          <w:numId w:val="2"/>
         </w:numPr>
       </w:pPr>
       <w:r>
-        <w:t>Pit Stops</w:t>
+        <w:t>Understand which factor affect the most</w:t>
+      </w:r>
+    </w:p>
+    <w:p>
+      <w:r>
+        <w:t>These predictions should be shown in a simple way so any user can understand the objective of the project.</w:t>
+      </w:r>
+    </w:p>
+    <w:p>
+      <w:pPr>
+        <w:pStyle w:val="Heading2"/>
+      </w:pPr>
+      <w:r>
+        <w:t>Problem Analysis</w:t>
+      </w:r>
+    </w:p>
+    <w:p>
+      <w:r>
+        <w:t>The main problem for this project is how to predict a driver’s next lap time based on past and current data, and how accurate this prediction can be</w:t>
+      </w:r>
+      <w:r>
+        <w:t>.</w:t>
+      </w:r>
+      <w:r>
+        <w:t xml:space="preserve"> </w:t>
+      </w:r>
+      <w:r>
+        <w:t>Based on the previous Domain Understanding research, some of the main factors that affect lap times are:</w:t>
       </w:r>
     </w:p>
     <w:p>
@@ -108,11 +141,11 @@
         <w:pStyle w:val="ListParagraph"/>
         <w:numPr>
           <w:ilvl w:val="0"/>
-          <w:numId w:val="1"/>
+          <w:numId w:val="6"/>
         </w:numPr>
       </w:pPr>
       <w:r>
-        <w:t>Weather and Track Conditions</w:t>
+        <w:t>Previous and Current Lap Times</w:t>
       </w:r>
     </w:p>
     <w:p>
@@ -120,11 +153,47 @@
         <w:pStyle w:val="ListParagraph"/>
         <w:numPr>
           <w:ilvl w:val="0"/>
-          <w:numId w:val="1"/>
+          <w:numId w:val="6"/>
         </w:numPr>
       </w:pPr>
       <w:r>
-        <w:t>Fuel load</w:t>
+        <w:t>Tyre Degradation</w:t>
+      </w:r>
+    </w:p>
+    <w:p>
+      <w:pPr>
+        <w:pStyle w:val="ListParagraph"/>
+        <w:numPr>
+          <w:ilvl w:val="0"/>
+          <w:numId w:val="6"/>
+        </w:numPr>
+      </w:pPr>
+      <w:r>
+        <w:t>Traffic</w:t>
+      </w:r>
+    </w:p>
+    <w:p>
+      <w:pPr>
+        <w:pStyle w:val="ListParagraph"/>
+        <w:numPr>
+          <w:ilvl w:val="0"/>
+          <w:numId w:val="6"/>
+        </w:numPr>
+      </w:pPr>
+      <w:r>
+        <w:t>Pit Stops</w:t>
+      </w:r>
+    </w:p>
+    <w:p>
+      <w:pPr>
+        <w:pStyle w:val="ListParagraph"/>
+        <w:numPr>
+          <w:ilvl w:val="0"/>
+          <w:numId w:val="6"/>
+        </w:numPr>
+      </w:pPr>
+      <w:r>
+        <w:t>Weather and Track Conditions</w:t>
       </w:r>
     </w:p>
     <w:p>
@@ -279,6 +348,7 @@
           </w:tcPr>
           <w:p>
             <w:r>
+              <w:lastRenderedPageBreak/>
               <w:t>Session Type</w:t>
             </w:r>
           </w:p>
@@ -349,7 +419,7 @@
           </w:tcPr>
           <w:p>
             <w:r>
-              <w:t>Next driver lap time</w:t>
+              <w:t>Driver’s next lap time in seconds, as defined in the Domain Understanding.</w:t>
             </w:r>
           </w:p>
         </w:tc>
@@ -395,7 +465,6 @@
           </w:tcPr>
           <w:p>
             <w:r>
-              <w:lastRenderedPageBreak/>
               <w:t>Main Features</w:t>
             </w:r>
           </w:p>
@@ -437,7 +506,15 @@
           </w:tcPr>
           <w:p>
             <w:r>
-              <w:t>Formula 1 Grands Prix from 2022 to 2025</w:t>
+              <w:t xml:space="preserve">Formula 1 </w:t>
+            </w:r>
+            <w:proofErr w:type="spellStart"/>
+            <w:r>
+              <w:t>Grands</w:t>
+            </w:r>
+            <w:proofErr w:type="spellEnd"/>
+            <w:r>
+              <w:t xml:space="preserve"> Prix from 2022 to 2025</w:t>
             </w:r>
           </w:p>
         </w:tc>
@@ -648,7 +725,7 @@
     </w:tbl>
     <w:p>
       <w:pPr>
-        <w:pStyle w:val="Heading2"/>
+        <w:pStyle w:val="Heading3"/>
       </w:pPr>
       <w:r>
         <w:br/>
@@ -657,26 +734,38 @@
     </w:p>
     <w:p>
       <w:r>
-        <w:t>The current data I am working with has some challenges that may affect the end result.</w:t>
-      </w:r>
-      <w:r>
-        <w:t xml:space="preserve"> Some values may be missing, especially in weather, telemetry or race conditions, so this needs to be checked before training. </w:t>
-      </w:r>
-    </w:p>
-    <w:p>
-      <w:r>
-        <w:t>Some laps will be longer due to pit stops, safety cars or virtual ones, yellow flags or just traffic on the race track, so for this, I will need to treat these ones in a separate way,  but it might not be a good idea to drop them totally. These kind of laps are outliers in our data, however can still be useful for the project.</w:t>
-      </w:r>
-    </w:p>
-    <w:p>
-      <w:r>
-        <w:t>Another challenge are the different circuits, as they have different characteristics, length, amount of laps, different conditions and they are always independent between themselves, even if they are the same track, just in different years.</w:t>
+        <w:t>The current data I am working with has some challenges and limitations that may affect the end result. Some values may be missing, especially in weather, telemetry or race conditions, so this needs to be checked before training.</w:t>
       </w:r>
     </w:p>
     <w:p>
       <w:r>
         <w:lastRenderedPageBreak/>
-        <w:t>Lastly, data leakage is the biggest challenge, as it is easy to be distracted and code the model to look at future lap times, so I will need to be looking into the code, to create this separation.</w:t>
+        <w:t>Some laps will also be longer because of pit stops, Safety Cars, VSCs, yellow flags, traffic or unexpected race events. These kinds of laps may look like outliers in the data, however they are still part of a real Formula 1 race. Because of this, it may not be a good idea to remove them completely. Instead, I will need to identify them and analyse how they affect the model.</w:t>
+      </w:r>
+    </w:p>
+    <w:p>
+      <w:r>
+        <w:t>Another challenge is the difference between circuits. Each circuit has different characteristics, length, number of laps and racing conditions. Because of this, a model may perform better on some circuits than others.</w:t>
+      </w:r>
+    </w:p>
+    <w:p>
+      <w:r>
+        <w:t>Traffic may also affect the predictions because a driver can lose time behind another car, which may create a bigger difference between the predicted lap time and the real lap time.</w:t>
+      </w:r>
+    </w:p>
+    <w:p>
+      <w:r>
+        <w:t>Weather changes are another limitation. From one lap to another, conditions can change, for example from dry to rain, depending on the track and race.</w:t>
+      </w:r>
+    </w:p>
+    <w:p>
+      <w:r>
+        <w:t>Missing data is also a limitation. Some variables may not be available, which can reduce the amount of useful information for the model. One important example is fuel load. Fuel load can affect lap time, however it is not directly available in the dataset, so I may need to make an assumption or estimate it based on the race progress.</w:t>
+      </w:r>
+    </w:p>
+    <w:p>
+      <w:r>
+        <w:t>These challenges mean that the model may not perform equally well in every race or condition. Because of this, the results will also be compared between different circuits and race situations.</w:t>
       </w:r>
     </w:p>
     <w:p>
@@ -684,214 +773,110 @@
         <w:pStyle w:val="Heading2"/>
       </w:pPr>
       <w:r>
-        <w:t>User Requirements</w:t>
-      </w:r>
-    </w:p>
-    <w:p>
-      <w:r>
-        <w:t>The user should be able to:</w:t>
-      </w:r>
-    </w:p>
-    <w:p>
-      <w:pPr>
-        <w:pStyle w:val="ListParagraph"/>
+        <w:t>Success criteria</w:t>
+      </w:r>
+    </w:p>
+    <w:p>
+      <w:r>
+        <w:t>The model will be compared with a persistence baseline, which predicts that the next lap time is equal to the current lap time.</w:t>
+      </w:r>
+    </w:p>
+    <w:p>
+      <w:r>
+        <w:t>For example, if the current lap time is 90 seconds, the baseline will also predict 90 seconds for the next lap.</w:t>
+      </w:r>
+    </w:p>
+    <w:p>
+      <w:r>
+        <w:t>The main success criteria for the project are:</w:t>
+      </w:r>
+    </w:p>
+    <w:p>
+      <w:pPr>
         <w:numPr>
           <w:ilvl w:val="0"/>
-          <w:numId w:val="2"/>
+          <w:numId w:val="7"/>
         </w:numPr>
       </w:pPr>
       <w:r>
-        <w:t>Select a driver and a track</w:t>
-      </w:r>
-    </w:p>
-    <w:p>
-      <w:pPr>
-        <w:pStyle w:val="ListParagraph"/>
+        <w:t>The final model should perform better than the persistence baseline.</w:t>
+      </w:r>
+    </w:p>
+    <w:p>
+      <w:pPr>
         <w:numPr>
           <w:ilvl w:val="0"/>
-          <w:numId w:val="2"/>
+          <w:numId w:val="7"/>
         </w:numPr>
       </w:pPr>
       <w:r>
-        <w:t>See the predicted next lap</w:t>
-      </w:r>
-    </w:p>
-    <w:p>
-      <w:pPr>
-        <w:pStyle w:val="ListParagraph"/>
+        <w:t>The project target is to reduce the MAE by at least 10% compared with the baseline.</w:t>
+      </w:r>
+    </w:p>
+    <w:p>
+      <w:pPr>
         <w:numPr>
           <w:ilvl w:val="0"/>
-          <w:numId w:val="2"/>
+          <w:numId w:val="7"/>
         </w:numPr>
       </w:pPr>
       <w:r>
-        <w:t>See the comparison between real life and predicted lap</w:t>
-      </w:r>
-    </w:p>
-    <w:p>
-      <w:pPr>
-        <w:pStyle w:val="ListParagraph"/>
+        <w:t>MAE in seconds will be the main metric, because it makes it easy to understand how far the prediction is from the real lap time.</w:t>
+      </w:r>
+    </w:p>
+    <w:p>
+      <w:pPr>
         <w:numPr>
           <w:ilvl w:val="0"/>
-          <w:numId w:val="2"/>
+          <w:numId w:val="7"/>
         </w:numPr>
       </w:pPr>
       <w:r>
-        <w:t>Understand which factor affect the most</w:t>
-      </w:r>
-    </w:p>
-    <w:p>
-      <w:r>
-        <w:t>These predictions should be shown in a simple way so any user can understand the objective of the project.</w:t>
-      </w:r>
-    </w:p>
-    <w:p>
-      <w:pPr>
-        <w:pStyle w:val="Heading2"/>
-      </w:pPr>
-      <w:r>
-        <w:drawing>
-          <wp:anchor distT="0" distB="0" distL="114300" distR="114300" simplePos="0" relativeHeight="251658240" behindDoc="1" locked="0" layoutInCell="1" allowOverlap="1" wp14:anchorId="1C30EB04" wp14:editId="74CB25F1">
-            <wp:simplePos x="0" y="0"/>
-            <wp:positionH relativeFrom="margin">
-              <wp:align>center</wp:align>
-            </wp:positionH>
-            <wp:positionV relativeFrom="paragraph">
-              <wp:posOffset>445135</wp:posOffset>
-            </wp:positionV>
-            <wp:extent cx="7200900" cy="1257300"/>
-            <wp:effectExtent l="0" t="0" r="0" b="0"/>
-            <wp:wrapTight wrapText="bothSides">
-              <wp:wrapPolygon edited="0">
-                <wp:start x="0" y="0"/>
-                <wp:lineTo x="0" y="21273"/>
-                <wp:lineTo x="21543" y="21273"/>
-                <wp:lineTo x="21543" y="0"/>
-                <wp:lineTo x="0" y="0"/>
-              </wp:wrapPolygon>
-            </wp:wrapTight>
-            <wp:docPr id="85473685" name="Picture 1"/>
-            <wp:cNvGraphicFramePr>
-              <a:graphicFrameLocks xmlns:a="http://schemas.openxmlformats.org/drawingml/2006/main" noChangeAspect="1"/>
-            </wp:cNvGraphicFramePr>
-            <a:graphic xmlns:a="http://schemas.openxmlformats.org/drawingml/2006/main">
-              <a:graphicData uri="http://schemas.openxmlformats.org/drawingml/2006/picture">
-                <pic:pic xmlns:pic="http://schemas.openxmlformats.org/drawingml/2006/picture">
-                  <pic:nvPicPr>
-                    <pic:cNvPr id="85473685" name=""/>
-                    <pic:cNvPicPr/>
-                  </pic:nvPicPr>
-                  <pic:blipFill>
-                    <a:blip r:embed="rId6">
-                      <a:extLst>
-                        <a:ext uri="{28A0092B-C50C-407E-A947-70E740481C1C}">
-                          <a14:useLocalDpi xmlns:a14="http://schemas.microsoft.com/office/drawing/2010/main" val="0"/>
-                        </a:ext>
-                      </a:extLst>
-                    </a:blip>
-                    <a:stretch>
-                      <a:fillRect/>
-                    </a:stretch>
-                  </pic:blipFill>
-                  <pic:spPr>
-                    <a:xfrm>
-                      <a:off x="0" y="0"/>
-                      <a:ext cx="7200900" cy="1257300"/>
-                    </a:xfrm>
-                    <a:prstGeom prst="rect">
-                      <a:avLst/>
-                    </a:prstGeom>
-                  </pic:spPr>
-                </pic:pic>
-              </a:graphicData>
-            </a:graphic>
-            <wp14:sizeRelH relativeFrom="margin">
-              <wp14:pctWidth>0</wp14:pctWidth>
-            </wp14:sizeRelH>
-            <wp14:sizeRelV relativeFrom="margin">
-              <wp14:pctHeight>0</wp14:pctHeight>
-            </wp14:sizeRelV>
-          </wp:anchor>
-        </w:drawing>
-      </w:r>
-      <w:r>
-        <w:t>AI/technical requirements</w:t>
-      </w:r>
-    </w:p>
-    <w:p>
-      <w:pPr>
-        <w:pStyle w:val="Heading2"/>
-      </w:pPr>
-      <w:r>
-        <w:t>Risks/Limitations</w:t>
-      </w:r>
-    </w:p>
-    <w:p>
-      <w:r>
-        <w:t>There are many different risks and limitations in this project, such as:</w:t>
-      </w:r>
-    </w:p>
-    <w:p>
-      <w:pPr>
-        <w:pStyle w:val="ListParagraph"/>
+        <w:t>The model should only use information available at the end of the current lap, so no future information is used.</w:t>
+      </w:r>
+    </w:p>
+    <w:p>
+      <w:pPr>
         <w:numPr>
           <w:ilvl w:val="0"/>
-          <w:numId w:val="3"/>
+          <w:numId w:val="7"/>
         </w:numPr>
       </w:pPr>
       <w:r>
-        <w:t>Unexpected events: Safety Cars, VSC, yellow flags, change of weather or mechanical problems</w:t>
-      </w:r>
-    </w:p>
-    <w:p>
-      <w:pPr>
-        <w:pStyle w:val="ListParagraph"/>
+        <w:lastRenderedPageBreak/>
+        <w:t>The model should be tested on different races and circuits to see if it performs consistently.</w:t>
+      </w:r>
+    </w:p>
+    <w:p>
+      <w:pPr>
         <w:numPr>
           <w:ilvl w:val="0"/>
-          <w:numId w:val="3"/>
+          <w:numId w:val="7"/>
         </w:numPr>
       </w:pPr>
       <w:r>
-        <w:t>Traffic: the amount of traffic in the track may affect the predictions, due to  higher differences between model and real life</w:t>
-      </w:r>
-    </w:p>
-    <w:p>
-      <w:pPr>
-        <w:pStyle w:val="ListParagraph"/>
+        <w:t>The final results should make it possible to compare the predicted lap time with the real lap time.</w:t>
+      </w:r>
+    </w:p>
+    <w:p>
+      <w:pPr>
         <w:numPr>
           <w:ilvl w:val="0"/>
-          <w:numId w:val="3"/>
+          <w:numId w:val="7"/>
         </w:numPr>
       </w:pPr>
       <w:r>
-        <w:t>Weather changes: from one lap to another</w:t>
-      </w:r>
-      <w:r>
-        <w:t>, it can go from sun to rain depending on the track and season.</w:t>
-      </w:r>
-    </w:p>
-    <w:p>
-      <w:pPr>
-        <w:pStyle w:val="ListParagraph"/>
-        <w:numPr>
-          <w:ilvl w:val="0"/>
-          <w:numId w:val="3"/>
-        </w:numPr>
-      </w:pPr>
-      <w:r>
-        <w:t>Missing data: some variables may be missing, which can reduce the  amount of useful data. The main missing data in this dataset is the fuel load, as it is useful to understand some relationships between variables, however I will need to make an assumption in that area</w:t>
-      </w:r>
-    </w:p>
-    <w:p>
-      <w:pPr>
-        <w:pStyle w:val="ListParagraph"/>
-        <w:numPr>
-          <w:ilvl w:val="0"/>
-          <w:numId w:val="3"/>
-        </w:numPr>
-      </w:pPr>
-      <w:r>
-        <w:t>Generalization: the model may perform well in some circuits, but in others not, because of unexpected events or weather conditions</w:t>
+        <w:t>The project should also show which features have the most influence on the prediction.</w:t>
+      </w:r>
+    </w:p>
+    <w:p>
+      <w:r>
+        <w:t>RMSE and R² will also be used to give additional information about the model performance.</w:t>
+      </w:r>
+    </w:p>
+    <w:p>
+      <w:r>
+        <w:t>Models and features will be selected using the 2024 validation data. The final selected model will then be evaluated using the 2025 test data.</w:t>
       </w:r>
     </w:p>
     <w:p>
@@ -899,78 +884,6 @@
         <w:pStyle w:val="Heading2"/>
       </w:pPr>
       <w:r>
-        <w:lastRenderedPageBreak/>
-        <w:t>Success criteria</w:t>
-      </w:r>
-    </w:p>
-    <w:p>
-      <w:r>
-        <w:t>The project will be considered successful if the model can predict the next lap time with useful accuracy and perform better than a simple baseline.</w:t>
-      </w:r>
-    </w:p>
-    <w:p>
-      <w:r>
-        <w:t>The main success criteria will be:</w:t>
-      </w:r>
-    </w:p>
-    <w:p>
-      <w:pPr>
-        <w:pStyle w:val="ListParagraph"/>
-        <w:numPr>
-          <w:ilvl w:val="0"/>
-          <w:numId w:val="4"/>
-        </w:numPr>
-      </w:pPr>
-      <w:r>
-        <w:t>Achieve lower than 10% MAE than the baseline</w:t>
-      </w:r>
-    </w:p>
-    <w:p>
-      <w:pPr>
-        <w:pStyle w:val="ListParagraph"/>
-        <w:numPr>
-          <w:ilvl w:val="0"/>
-          <w:numId w:val="4"/>
-        </w:numPr>
-      </w:pPr>
-      <w:r>
-        <w:t>MAE on racing laps be less than 0.9</w:t>
-      </w:r>
-    </w:p>
-    <w:p>
-      <w:pPr>
-        <w:pStyle w:val="ListParagraph"/>
-        <w:numPr>
-          <w:ilvl w:val="0"/>
-          <w:numId w:val="4"/>
-        </w:numPr>
-      </w:pPr>
-      <w:r>
-        <w:t>No information of future laps inside model</w:t>
-      </w:r>
-    </w:p>
-    <w:p>
-      <w:pPr>
-        <w:pStyle w:val="ListParagraph"/>
-        <w:numPr>
-          <w:ilvl w:val="0"/>
-          <w:numId w:val="4"/>
-        </w:numPr>
-      </w:pPr>
-      <w:r>
-        <w:t>Final model with lower RMSE than baseline</w:t>
-      </w:r>
-    </w:p>
-    <w:p>
-      <w:r>
-        <w:t>The main success condition is that the machine learning model performs better than the previous-lap baseline on unseen race data.</w:t>
-      </w:r>
-    </w:p>
-    <w:p>
-      <w:pPr>
-        <w:pStyle w:val="Heading2"/>
-      </w:pPr>
-      <w:r>
         <w:t>Conclusion</w:t>
       </w:r>
     </w:p>
@@ -997,11 +910,6 @@
     <w:p>
       <w:r>
         <w:t>The model will only use information available at the end of the current lap to avoid data leakage.</w:t>
-      </w:r>
-    </w:p>
-    <w:p>
-      <w:r>
-        <w:t>The next step is to prepare and analyse the full dataset, select the most useful features, create a previous-lap baseline, and train different regression models. The final models will be compared using MAE, RMSE, and R².</w:t>
       </w:r>
     </w:p>
     <w:p/>
@@ -1132,6 +1040,122 @@
     </w:lvl>
   </w:abstractNum>
   <w:abstractNum w:abstractNumId="1" w15:restartNumberingAfterBreak="0">
+    <w:nsid w:val="1142355E"/>
+    <w:multiLevelType w:val="multilevel"/>
+    <w:tmpl w:val="3F88A22E"/>
+    <w:lvl w:ilvl="0">
+      <w:start w:val="1"/>
+      <w:numFmt w:val="decimal"/>
+      <w:lvlText w:val="%1."/>
+      <w:lvlJc w:val="left"/>
+      <w:pPr>
+        <w:tabs>
+          <w:tab w:val="num" w:pos="720"/>
+        </w:tabs>
+        <w:ind w:left="720" w:hanging="360"/>
+      </w:pPr>
+      <w:rPr>
+        <w:rFonts w:hint="default"/>
+      </w:rPr>
+    </w:lvl>
+    <w:lvl w:ilvl="1" w:tentative="1">
+      <w:start w:val="1"/>
+      <w:numFmt w:val="decimal"/>
+      <w:lvlText w:val="%2."/>
+      <w:lvlJc w:val="left"/>
+      <w:pPr>
+        <w:tabs>
+          <w:tab w:val="num" w:pos="1440"/>
+        </w:tabs>
+        <w:ind w:left="1440" w:hanging="360"/>
+      </w:pPr>
+    </w:lvl>
+    <w:lvl w:ilvl="2" w:tentative="1">
+      <w:start w:val="1"/>
+      <w:numFmt w:val="decimal"/>
+      <w:lvlText w:val="%3."/>
+      <w:lvlJc w:val="left"/>
+      <w:pPr>
+        <w:tabs>
+          <w:tab w:val="num" w:pos="2160"/>
+        </w:tabs>
+        <w:ind w:left="2160" w:hanging="360"/>
+      </w:pPr>
+    </w:lvl>
+    <w:lvl w:ilvl="3" w:tentative="1">
+      <w:start w:val="1"/>
+      <w:numFmt w:val="decimal"/>
+      <w:lvlText w:val="%4."/>
+      <w:lvlJc w:val="left"/>
+      <w:pPr>
+        <w:tabs>
+          <w:tab w:val="num" w:pos="2880"/>
+        </w:tabs>
+        <w:ind w:left="2880" w:hanging="360"/>
+      </w:pPr>
+    </w:lvl>
+    <w:lvl w:ilvl="4" w:tentative="1">
+      <w:start w:val="1"/>
+      <w:numFmt w:val="decimal"/>
+      <w:lvlText w:val="%5."/>
+      <w:lvlJc w:val="left"/>
+      <w:pPr>
+        <w:tabs>
+          <w:tab w:val="num" w:pos="3600"/>
+        </w:tabs>
+        <w:ind w:left="3600" w:hanging="360"/>
+      </w:pPr>
+    </w:lvl>
+    <w:lvl w:ilvl="5" w:tentative="1">
+      <w:start w:val="1"/>
+      <w:numFmt w:val="decimal"/>
+      <w:lvlText w:val="%6."/>
+      <w:lvlJc w:val="left"/>
+      <w:pPr>
+        <w:tabs>
+          <w:tab w:val="num" w:pos="4320"/>
+        </w:tabs>
+        <w:ind w:left="4320" w:hanging="360"/>
+      </w:pPr>
+    </w:lvl>
+    <w:lvl w:ilvl="6" w:tentative="1">
+      <w:start w:val="1"/>
+      <w:numFmt w:val="decimal"/>
+      <w:lvlText w:val="%7."/>
+      <w:lvlJc w:val="left"/>
+      <w:pPr>
+        <w:tabs>
+          <w:tab w:val="num" w:pos="5040"/>
+        </w:tabs>
+        <w:ind w:left="5040" w:hanging="360"/>
+      </w:pPr>
+    </w:lvl>
+    <w:lvl w:ilvl="7" w:tentative="1">
+      <w:start w:val="1"/>
+      <w:numFmt w:val="decimal"/>
+      <w:lvlText w:val="%8."/>
+      <w:lvlJc w:val="left"/>
+      <w:pPr>
+        <w:tabs>
+          <w:tab w:val="num" w:pos="5760"/>
+        </w:tabs>
+        <w:ind w:left="5760" w:hanging="360"/>
+      </w:pPr>
+    </w:lvl>
+    <w:lvl w:ilvl="8" w:tentative="1">
+      <w:start w:val="1"/>
+      <w:numFmt w:val="decimal"/>
+      <w:lvlText w:val="%9."/>
+      <w:lvlJc w:val="left"/>
+      <w:pPr>
+        <w:tabs>
+          <w:tab w:val="num" w:pos="6480"/>
+        </w:tabs>
+        <w:ind w:left="6480" w:hanging="360"/>
+      </w:pPr>
+    </w:lvl>
+  </w:abstractNum>
+  <w:abstractNum w:abstractNumId="2" w15:restartNumberingAfterBreak="0">
     <w:nsid w:val="460870B2"/>
     <w:multiLevelType w:val="hybridMultilevel"/>
     <w:tmpl w:val="62DC1316"/>
@@ -1244,7 +1268,7 @@
       </w:rPr>
     </w:lvl>
   </w:abstractNum>
-  <w:abstractNum w:abstractNumId="2" w15:restartNumberingAfterBreak="0">
+  <w:abstractNum w:abstractNumId="3" w15:restartNumberingAfterBreak="0">
     <w:nsid w:val="4C4253BC"/>
     <w:multiLevelType w:val="hybridMultilevel"/>
     <w:tmpl w:val="4F62F944"/>
@@ -1357,7 +1381,120 @@
       </w:rPr>
     </w:lvl>
   </w:abstractNum>
-  <w:abstractNum w:abstractNumId="3" w15:restartNumberingAfterBreak="0">
+  <w:abstractNum w:abstractNumId="4" w15:restartNumberingAfterBreak="0">
+    <w:nsid w:val="5AC33A7F"/>
+    <w:multiLevelType w:val="hybridMultilevel"/>
+    <w:tmpl w:val="E3B42F90"/>
+    <w:lvl w:ilvl="0" w:tplc="0809000F">
+      <w:start w:val="1"/>
+      <w:numFmt w:val="decimal"/>
+      <w:lvlText w:val="%1."/>
+      <w:lvlJc w:val="left"/>
+      <w:pPr>
+        <w:ind w:left="720" w:hanging="360"/>
+      </w:pPr>
+      <w:rPr>
+        <w:rFonts w:hint="default"/>
+      </w:rPr>
+    </w:lvl>
+    <w:lvl w:ilvl="1" w:tplc="FFFFFFFF" w:tentative="1">
+      <w:start w:val="1"/>
+      <w:numFmt w:val="bullet"/>
+      <w:lvlText w:val="o"/>
+      <w:lvlJc w:val="left"/>
+      <w:pPr>
+        <w:ind w:left="1440" w:hanging="360"/>
+      </w:pPr>
+      <w:rPr>
+        <w:rFonts w:ascii="Courier New" w:hAnsi="Courier New" w:cs="Courier New" w:hint="default"/>
+      </w:rPr>
+    </w:lvl>
+    <w:lvl w:ilvl="2" w:tplc="FFFFFFFF" w:tentative="1">
+      <w:start w:val="1"/>
+      <w:numFmt w:val="bullet"/>
+      <w:lvlText w:val=""/>
+      <w:lvlJc w:val="left"/>
+      <w:pPr>
+        <w:ind w:left="2160" w:hanging="360"/>
+      </w:pPr>
+      <w:rPr>
+        <w:rFonts w:ascii="Wingdings" w:hAnsi="Wingdings" w:hint="default"/>
+      </w:rPr>
+    </w:lvl>
+    <w:lvl w:ilvl="3" w:tplc="FFFFFFFF" w:tentative="1">
+      <w:start w:val="1"/>
+      <w:numFmt w:val="bullet"/>
+      <w:lvlText w:val=""/>
+      <w:lvlJc w:val="left"/>
+      <w:pPr>
+        <w:ind w:left="2880" w:hanging="360"/>
+      </w:pPr>
+      <w:rPr>
+        <w:rFonts w:ascii="Symbol" w:hAnsi="Symbol" w:hint="default"/>
+      </w:rPr>
+    </w:lvl>
+    <w:lvl w:ilvl="4" w:tplc="FFFFFFFF" w:tentative="1">
+      <w:start w:val="1"/>
+      <w:numFmt w:val="bullet"/>
+      <w:lvlText w:val="o"/>
+      <w:lvlJc w:val="left"/>
+      <w:pPr>
+        <w:ind w:left="3600" w:hanging="360"/>
+      </w:pPr>
+      <w:rPr>
+        <w:rFonts w:ascii="Courier New" w:hAnsi="Courier New" w:cs="Courier New" w:hint="default"/>
+      </w:rPr>
+    </w:lvl>
+    <w:lvl w:ilvl="5" w:tplc="FFFFFFFF" w:tentative="1">
+      <w:start w:val="1"/>
+      <w:numFmt w:val="bullet"/>
+      <w:lvlText w:val=""/>
+      <w:lvlJc w:val="left"/>
+      <w:pPr>
+        <w:ind w:left="4320" w:hanging="360"/>
+      </w:pPr>
+      <w:rPr>
+        <w:rFonts w:ascii="Wingdings" w:hAnsi="Wingdings" w:hint="default"/>
+      </w:rPr>
+    </w:lvl>
+    <w:lvl w:ilvl="6" w:tplc="FFFFFFFF" w:tentative="1">
+      <w:start w:val="1"/>
+      <w:numFmt w:val="bullet"/>
+      <w:lvlText w:val=""/>
+      <w:lvlJc w:val="left"/>
+      <w:pPr>
+        <w:ind w:left="5040" w:hanging="360"/>
+      </w:pPr>
+      <w:rPr>
+        <w:rFonts w:ascii="Symbol" w:hAnsi="Symbol" w:hint="default"/>
+      </w:rPr>
+    </w:lvl>
+    <w:lvl w:ilvl="7" w:tplc="FFFFFFFF" w:tentative="1">
+      <w:start w:val="1"/>
+      <w:numFmt w:val="bullet"/>
+      <w:lvlText w:val="o"/>
+      <w:lvlJc w:val="left"/>
+      <w:pPr>
+        <w:ind w:left="5760" w:hanging="360"/>
+      </w:pPr>
+      <w:rPr>
+        <w:rFonts w:ascii="Courier New" w:hAnsi="Courier New" w:cs="Courier New" w:hint="default"/>
+      </w:rPr>
+    </w:lvl>
+    <w:lvl w:ilvl="8" w:tplc="FFFFFFFF" w:tentative="1">
+      <w:start w:val="1"/>
+      <w:numFmt w:val="bullet"/>
+      <w:lvlText w:val=""/>
+      <w:lvlJc w:val="left"/>
+      <w:pPr>
+        <w:ind w:left="6480" w:hanging="360"/>
+      </w:pPr>
+      <w:rPr>
+        <w:rFonts w:ascii="Wingdings" w:hAnsi="Wingdings" w:hint="default"/>
+      </w:rPr>
+    </w:lvl>
+  </w:abstractNum>
+  <w:abstractNum w:abstractNumId="5" w15:restartNumberingAfterBreak="0">
     <w:nsid w:val="73FD0907"/>
     <w:multiLevelType w:val="hybridMultilevel"/>
     <w:tmpl w:val="0A8E3DCC"/>
@@ -1470,17 +1607,139 @@
       </w:rPr>
     </w:lvl>
   </w:abstractNum>
+  <w:abstractNum w:abstractNumId="6" w15:restartNumberingAfterBreak="0">
+    <w:nsid w:val="7FA95503"/>
+    <w:multiLevelType w:val="multilevel"/>
+    <w:tmpl w:val="59B01E80"/>
+    <w:lvl w:ilvl="0">
+      <w:start w:val="1"/>
+      <w:numFmt w:val="decimal"/>
+      <w:lvlText w:val="%1."/>
+      <w:lvlJc w:val="left"/>
+      <w:pPr>
+        <w:tabs>
+          <w:tab w:val="num" w:pos="720"/>
+        </w:tabs>
+        <w:ind w:left="720" w:hanging="360"/>
+      </w:pPr>
+    </w:lvl>
+    <w:lvl w:ilvl="1" w:tentative="1">
+      <w:start w:val="1"/>
+      <w:numFmt w:val="decimal"/>
+      <w:lvlText w:val="%2."/>
+      <w:lvlJc w:val="left"/>
+      <w:pPr>
+        <w:tabs>
+          <w:tab w:val="num" w:pos="1440"/>
+        </w:tabs>
+        <w:ind w:left="1440" w:hanging="360"/>
+      </w:pPr>
+    </w:lvl>
+    <w:lvl w:ilvl="2" w:tentative="1">
+      <w:start w:val="1"/>
+      <w:numFmt w:val="decimal"/>
+      <w:lvlText w:val="%3."/>
+      <w:lvlJc w:val="left"/>
+      <w:pPr>
+        <w:tabs>
+          <w:tab w:val="num" w:pos="2160"/>
+        </w:tabs>
+        <w:ind w:left="2160" w:hanging="360"/>
+      </w:pPr>
+    </w:lvl>
+    <w:lvl w:ilvl="3" w:tentative="1">
+      <w:start w:val="1"/>
+      <w:numFmt w:val="decimal"/>
+      <w:lvlText w:val="%4."/>
+      <w:lvlJc w:val="left"/>
+      <w:pPr>
+        <w:tabs>
+          <w:tab w:val="num" w:pos="2880"/>
+        </w:tabs>
+        <w:ind w:left="2880" w:hanging="360"/>
+      </w:pPr>
+    </w:lvl>
+    <w:lvl w:ilvl="4" w:tentative="1">
+      <w:start w:val="1"/>
+      <w:numFmt w:val="decimal"/>
+      <w:lvlText w:val="%5."/>
+      <w:lvlJc w:val="left"/>
+      <w:pPr>
+        <w:tabs>
+          <w:tab w:val="num" w:pos="3600"/>
+        </w:tabs>
+        <w:ind w:left="3600" w:hanging="360"/>
+      </w:pPr>
+    </w:lvl>
+    <w:lvl w:ilvl="5" w:tentative="1">
+      <w:start w:val="1"/>
+      <w:numFmt w:val="decimal"/>
+      <w:lvlText w:val="%6."/>
+      <w:lvlJc w:val="left"/>
+      <w:pPr>
+        <w:tabs>
+          <w:tab w:val="num" w:pos="4320"/>
+        </w:tabs>
+        <w:ind w:left="4320" w:hanging="360"/>
+      </w:pPr>
+    </w:lvl>
+    <w:lvl w:ilvl="6" w:tentative="1">
+      <w:start w:val="1"/>
+      <w:numFmt w:val="decimal"/>
+      <w:lvlText w:val="%7."/>
+      <w:lvlJc w:val="left"/>
+      <w:pPr>
+        <w:tabs>
+          <w:tab w:val="num" w:pos="5040"/>
+        </w:tabs>
+        <w:ind w:left="5040" w:hanging="360"/>
+      </w:pPr>
+    </w:lvl>
+    <w:lvl w:ilvl="7" w:tentative="1">
+      <w:start w:val="1"/>
+      <w:numFmt w:val="decimal"/>
+      <w:lvlText w:val="%8."/>
+      <w:lvlJc w:val="left"/>
+      <w:pPr>
+        <w:tabs>
+          <w:tab w:val="num" w:pos="5760"/>
+        </w:tabs>
+        <w:ind w:left="5760" w:hanging="360"/>
+      </w:pPr>
+    </w:lvl>
+    <w:lvl w:ilvl="8" w:tentative="1">
+      <w:start w:val="1"/>
+      <w:numFmt w:val="decimal"/>
+      <w:lvlText w:val="%9."/>
+      <w:lvlJc w:val="left"/>
+      <w:pPr>
+        <w:tabs>
+          <w:tab w:val="num" w:pos="6480"/>
+        </w:tabs>
+        <w:ind w:left="6480" w:hanging="360"/>
+      </w:pPr>
+    </w:lvl>
+  </w:abstractNum>
   <w:num w:numId="1" w16cid:durableId="1064060507">
-    <w:abstractNumId w:val="2"/>
+    <w:abstractNumId w:val="3"/>
   </w:num>
   <w:num w:numId="2" w16cid:durableId="2092387155">
-    <w:abstractNumId w:val="3"/>
+    <w:abstractNumId w:val="5"/>
   </w:num>
   <w:num w:numId="3" w16cid:durableId="1112940213">
-    <w:abstractNumId w:val="1"/>
+    <w:abstractNumId w:val="2"/>
   </w:num>
   <w:num w:numId="4" w16cid:durableId="847713888">
     <w:abstractNumId w:val="0"/>
+  </w:num>
+  <w:num w:numId="5" w16cid:durableId="711534502">
+    <w:abstractNumId w:val="6"/>
+  </w:num>
+  <w:num w:numId="6" w16cid:durableId="1701736898">
+    <w:abstractNumId w:val="4"/>
+  </w:num>
+  <w:num w:numId="7" w16cid:durableId="309553103">
+    <w:abstractNumId w:val="1"/>
   </w:num>
 </w:numbering>
 </file>
@@ -1935,7 +2194,6 @@
     <w:next w:val="Normal"/>
     <w:link w:val="Heading3Char"/>
     <w:uiPriority w:val="9"/>
-    <w:semiHidden/>
     <w:unhideWhenUsed/>
     <w:qFormat/>
     <w:rsid w:val="00373C02"/>
@@ -2141,7 +2399,6 @@
     <w:basedOn w:val="DefaultParagraphFont"/>
     <w:link w:val="Heading3"/>
     <w:uiPriority w:val="9"/>
-    <w:semiHidden/>
     <w:rsid w:val="00373C02"/>
     <w:rPr>
       <w:rFonts w:eastAsiaTheme="majorEastAsia" w:cstheme="majorBidi"/>

</xml_diff>